<commit_message>
Changing docx and pdf
</commit_message>
<xml_diff>
--- a/KSiS4.docx
+++ b/KSiS4.docx
@@ -783,16 +783,49 @@
         <w:rPr>
           <w:rFonts w:cs="Times New Roman"/>
           <w:szCs w:val="28"/>
-          <w:lang/>
-        </w:rPr>
-      </w:pPr>
-      <w:r>
-        <w:rPr>
-          <w:rFonts w:cs="Times New Roman"/>
-          <w:szCs w:val="28"/>
-          <w:lang/>
-        </w:rPr>
-        <w:t>Необходимо реализовать простой прокси-сервер, выполняющий журналирование проксируемых HTTP-запросов.</w:t>
+          <w:lang w:val="ru-RU"/>
+        </w:rPr>
+      </w:pPr>
+      <w:r>
+        <w:rPr>
+          <w:rFonts w:cs="Times New Roman"/>
+          <w:szCs w:val="28"/>
+          <w:lang w:val="ru-RU"/>
+        </w:rPr>
+        <w:t xml:space="preserve">Необходимо реализовать простой прокси-сервер, выполняющий журналирование </w:t>
+      </w:r>
+      <w:proofErr w:type="spellStart"/>
+      <w:r>
+        <w:rPr>
+          <w:rFonts w:cs="Times New Roman"/>
+          <w:szCs w:val="28"/>
+          <w:lang w:val="ru-RU"/>
+        </w:rPr>
+        <w:t>проксируемых</w:t>
+      </w:r>
+      <w:proofErr w:type="spellEnd"/>
+      <w:r>
+        <w:rPr>
+          <w:rFonts w:cs="Times New Roman"/>
+          <w:szCs w:val="28"/>
+          <w:lang w:val="ru-RU"/>
+        </w:rPr>
+        <w:t xml:space="preserve"> </w:t>
+      </w:r>
+      <w:r>
+        <w:rPr>
+          <w:rFonts w:cs="Times New Roman"/>
+          <w:szCs w:val="28"/>
+        </w:rPr>
+        <w:t>HTTP</w:t>
+      </w:r>
+      <w:r>
+        <w:rPr>
+          <w:rFonts w:cs="Times New Roman"/>
+          <w:szCs w:val="28"/>
+          <w:lang w:val="ru-RU"/>
+        </w:rPr>
+        <w:t>-запросов.</w:t>
       </w:r>
     </w:p>
     <w:p>
@@ -801,16 +834,49 @@
         <w:rPr>
           <w:rFonts w:cs="Times New Roman"/>
           <w:szCs w:val="28"/>
-          <w:lang/>
-        </w:rPr>
-      </w:pPr>
-      <w:r>
-        <w:rPr>
-          <w:rFonts w:cs="Times New Roman"/>
-          <w:szCs w:val="28"/>
-          <w:lang/>
-        </w:rPr>
-        <w:t>Программа должна отображать в консоли журнал с краткой информацией о проксируемых запросах (URL и код ответа).</w:t>
+          <w:lang w:val="ru-RU"/>
+        </w:rPr>
+      </w:pPr>
+      <w:r>
+        <w:rPr>
+          <w:rFonts w:cs="Times New Roman"/>
+          <w:szCs w:val="28"/>
+          <w:lang w:val="ru-RU"/>
+        </w:rPr>
+        <w:t xml:space="preserve">Программа должна отображать в консоли журнал с краткой информацией о </w:t>
+      </w:r>
+      <w:proofErr w:type="spellStart"/>
+      <w:r>
+        <w:rPr>
+          <w:rFonts w:cs="Times New Roman"/>
+          <w:szCs w:val="28"/>
+          <w:lang w:val="ru-RU"/>
+        </w:rPr>
+        <w:t>проксируемых</w:t>
+      </w:r>
+      <w:proofErr w:type="spellEnd"/>
+      <w:r>
+        <w:rPr>
+          <w:rFonts w:cs="Times New Roman"/>
+          <w:szCs w:val="28"/>
+          <w:lang w:val="ru-RU"/>
+        </w:rPr>
+        <w:t xml:space="preserve"> запросах (</w:t>
+      </w:r>
+      <w:r>
+        <w:rPr>
+          <w:rFonts w:cs="Times New Roman"/>
+          <w:szCs w:val="28"/>
+        </w:rPr>
+        <w:t>URL</w:t>
+      </w:r>
+      <w:r>
+        <w:rPr>
+          <w:rFonts w:cs="Times New Roman"/>
+          <w:szCs w:val="28"/>
+          <w:lang w:val="ru-RU"/>
+        </w:rPr>
+        <w:t xml:space="preserve"> и код ответа).</w:t>
       </w:r>
     </w:p>
     <w:p>
@@ -819,16 +885,46 @@
         <w:rPr>
           <w:rFonts w:cs="Times New Roman"/>
           <w:szCs w:val="28"/>
-          <w:lang/>
-        </w:rPr>
-      </w:pPr>
-      <w:r>
-        <w:rPr>
-          <w:rFonts w:cs="Times New Roman"/>
-          <w:szCs w:val="28"/>
-          <w:lang/>
-        </w:rPr>
-        <w:t>Обязательной является поддержка HTTP, поддержка HTTPS не требуется.</w:t>
+          <w:lang w:val="ru-RU"/>
+        </w:rPr>
+      </w:pPr>
+      <w:r>
+        <w:rPr>
+          <w:rFonts w:cs="Times New Roman"/>
+          <w:szCs w:val="28"/>
+          <w:lang w:val="ru-RU"/>
+        </w:rPr>
+        <w:t xml:space="preserve">Обязательной является поддержка </w:t>
+      </w:r>
+      <w:r>
+        <w:rPr>
+          <w:rFonts w:cs="Times New Roman"/>
+          <w:szCs w:val="28"/>
+        </w:rPr>
+        <w:t>HTTP</w:t>
+      </w:r>
+      <w:r>
+        <w:rPr>
+          <w:rFonts w:cs="Times New Roman"/>
+          <w:szCs w:val="28"/>
+          <w:lang w:val="ru-RU"/>
+        </w:rPr>
+        <w:t xml:space="preserve">, поддержка </w:t>
+      </w:r>
+      <w:r>
+        <w:rPr>
+          <w:rFonts w:cs="Times New Roman"/>
+          <w:szCs w:val="28"/>
+        </w:rPr>
+        <w:t>HTTPS</w:t>
+      </w:r>
+      <w:r>
+        <w:rPr>
+          <w:rFonts w:cs="Times New Roman"/>
+          <w:szCs w:val="28"/>
+          <w:lang w:val="ru-RU"/>
+        </w:rPr>
+        <w:t xml:space="preserve"> не требуется.</w:t>
       </w:r>
     </w:p>
     <w:p>
@@ -837,16 +933,31 @@
         <w:rPr>
           <w:rFonts w:cs="Times New Roman"/>
           <w:szCs w:val="28"/>
-          <w:lang/>
-        </w:rPr>
-      </w:pPr>
-      <w:r>
-        <w:rPr>
-          <w:rFonts w:cs="Times New Roman"/>
-          <w:szCs w:val="28"/>
-          <w:lang/>
-        </w:rPr>
-        <w:t>Для проверки работоспособности необходимо настроить в браузере работу через прокси и попробовать загрузить ресурсы по HTTP:</w:t>
+          <w:lang w:val="ru-RU"/>
+        </w:rPr>
+      </w:pPr>
+      <w:r>
+        <w:rPr>
+          <w:rFonts w:cs="Times New Roman"/>
+          <w:szCs w:val="28"/>
+          <w:lang w:val="ru-RU"/>
+        </w:rPr>
+        <w:t xml:space="preserve">Для проверки работоспособности необходимо настроить в браузере работу через прокси и попробовать загрузить ресурсы по </w:t>
+      </w:r>
+      <w:r>
+        <w:rPr>
+          <w:rFonts w:cs="Times New Roman"/>
+          <w:szCs w:val="28"/>
+        </w:rPr>
+        <w:t>HTTP</w:t>
+      </w:r>
+      <w:r>
+        <w:rPr>
+          <w:rFonts w:cs="Times New Roman"/>
+          <w:szCs w:val="28"/>
+          <w:lang w:val="ru-RU"/>
+        </w:rPr>
+        <w:t>:</w:t>
       </w:r>
     </w:p>
     <w:p>
@@ -860,14 +971,12 @@
         <w:rPr>
           <w:rFonts w:cs="Times New Roman"/>
           <w:szCs w:val="28"/>
-          <w:lang/>
-        </w:rPr>
-      </w:pPr>
-      <w:r>
-        <w:rPr>
-          <w:rFonts w:cs="Times New Roman"/>
-          <w:szCs w:val="28"/>
-          <w:lang/>
+        </w:rPr>
+      </w:pPr>
+      <w:r>
+        <w:rPr>
+          <w:rFonts w:cs="Times New Roman"/>
+          <w:szCs w:val="28"/>
         </w:rPr>
         <w:t>http://example.com/ </w:t>
       </w:r>
@@ -888,16 +997,87 @@
         <w:rPr>
           <w:rFonts w:cs="Times New Roman"/>
           <w:szCs w:val="28"/>
-          <w:lang/>
-        </w:rPr>
-      </w:pPr>
-      <w:r>
-        <w:rPr>
-          <w:rFonts w:cs="Times New Roman"/>
-          <w:szCs w:val="28"/>
-          <w:lang/>
-        </w:rPr>
-        <w:t>http://live.legendy.by:8000/legendyfm - онлайн радио, необходимо для проверки, что соединение не разрывается раньше времени.</w:t>
+          <w:lang w:val="ru-RU"/>
+        </w:rPr>
+      </w:pPr>
+      <w:r>
+        <w:rPr>
+          <w:rFonts w:cs="Times New Roman"/>
+          <w:szCs w:val="28"/>
+        </w:rPr>
+        <w:t>http</w:t>
+      </w:r>
+      <w:r>
+        <w:rPr>
+          <w:rFonts w:cs="Times New Roman"/>
+          <w:szCs w:val="28"/>
+          <w:lang w:val="ru-RU"/>
+        </w:rPr>
+        <w:t>://</w:t>
+      </w:r>
+      <w:r>
+        <w:rPr>
+          <w:rFonts w:cs="Times New Roman"/>
+          <w:szCs w:val="28"/>
+        </w:rPr>
+        <w:t>live</w:t>
+      </w:r>
+      <w:r>
+        <w:rPr>
+          <w:rFonts w:cs="Times New Roman"/>
+          <w:szCs w:val="28"/>
+          <w:lang w:val="ru-RU"/>
+        </w:rPr>
+        <w:t>.</w:t>
+      </w:r>
+      <w:proofErr w:type="spellStart"/>
+      <w:r>
+        <w:rPr>
+          <w:rFonts w:cs="Times New Roman"/>
+          <w:szCs w:val="28"/>
+        </w:rPr>
+        <w:t>legendy</w:t>
+      </w:r>
+      <w:proofErr w:type="spellEnd"/>
+      <w:r>
+        <w:rPr>
+          <w:rFonts w:cs="Times New Roman"/>
+          <w:szCs w:val="28"/>
+          <w:lang w:val="ru-RU"/>
+        </w:rPr>
+        <w:t>.</w:t>
+      </w:r>
+      <w:r>
+        <w:rPr>
+          <w:rFonts w:cs="Times New Roman"/>
+          <w:szCs w:val="28"/>
+        </w:rPr>
+        <w:t>by</w:t>
+      </w:r>
+      <w:r>
+        <w:rPr>
+          <w:rFonts w:cs="Times New Roman"/>
+          <w:szCs w:val="28"/>
+          <w:lang w:val="ru-RU"/>
+        </w:rPr>
+        <w:t>:8000/</w:t>
+      </w:r>
+      <w:proofErr w:type="spellStart"/>
+      <w:r>
+        <w:rPr>
+          <w:rFonts w:cs="Times New Roman"/>
+          <w:szCs w:val="28"/>
+        </w:rPr>
+        <w:t>legendyfm</w:t>
+      </w:r>
+      <w:proofErr w:type="spellEnd"/>
+      <w:r>
+        <w:rPr>
+          <w:rFonts w:cs="Times New Roman"/>
+          <w:szCs w:val="28"/>
+          <w:lang w:val="ru-RU"/>
+        </w:rPr>
+        <w:t xml:space="preserve"> - онлайн радио, необходимо для проверки, что соединение не разрывается раньше времени.</w:t>
       </w:r>
     </w:p>
     <w:p>
@@ -906,16 +1086,46 @@
         <w:rPr>
           <w:rFonts w:cs="Times New Roman"/>
           <w:szCs w:val="28"/>
-          <w:lang/>
-        </w:rPr>
-      </w:pPr>
-      <w:r>
-        <w:rPr>
-          <w:rFonts w:cs="Times New Roman"/>
-          <w:szCs w:val="28"/>
-          <w:lang/>
-        </w:rPr>
-        <w:t>Особенности формата URI в HTTP-запросах к прокси-серверу</w:t>
+          <w:lang w:val="ru-RU"/>
+        </w:rPr>
+      </w:pPr>
+      <w:r>
+        <w:rPr>
+          <w:rFonts w:cs="Times New Roman"/>
+          <w:szCs w:val="28"/>
+          <w:lang w:val="ru-RU"/>
+        </w:rPr>
+        <w:t xml:space="preserve">Особенности формата </w:t>
+      </w:r>
+      <w:r>
+        <w:rPr>
+          <w:rFonts w:cs="Times New Roman"/>
+          <w:szCs w:val="28"/>
+        </w:rPr>
+        <w:t>URI</w:t>
+      </w:r>
+      <w:r>
+        <w:rPr>
+          <w:rFonts w:cs="Times New Roman"/>
+          <w:szCs w:val="28"/>
+          <w:lang w:val="ru-RU"/>
+        </w:rPr>
+        <w:t xml:space="preserve"> в </w:t>
+      </w:r>
+      <w:r>
+        <w:rPr>
+          <w:rFonts w:cs="Times New Roman"/>
+          <w:szCs w:val="28"/>
+        </w:rPr>
+        <w:t>HTTP</w:t>
+      </w:r>
+      <w:r>
+        <w:rPr>
+          <w:rFonts w:cs="Times New Roman"/>
+          <w:szCs w:val="28"/>
+          <w:lang w:val="ru-RU"/>
+        </w:rPr>
+        <w:t>-запросах к прокси-серверу</w:t>
       </w:r>
     </w:p>
     <w:p>
@@ -924,141 +1134,328 @@
         <w:rPr>
           <w:rFonts w:cs="Times New Roman"/>
           <w:szCs w:val="28"/>
-          <w:lang/>
-        </w:rPr>
-      </w:pPr>
-      <w:r>
-        <w:rPr>
-          <w:rFonts w:cs="Times New Roman"/>
-          <w:szCs w:val="28"/>
-          <w:lang/>
-        </w:rPr>
-        <w:t>В соответствии с RFC </w:t>
-      </w:r>
-      <w:r>
-        <w:fldChar w:fldCharType="begin"/>
-      </w:r>
-      <w:r>
-        <w:instrText>HYPERLINK</w:instrText>
-      </w:r>
-      <w:r>
-        <w:rPr>
-          <w:lang w:val="ru-RU"/>
-        </w:rPr>
-        <w:instrText xml:space="preserve"> "</w:instrText>
-      </w:r>
-      <w:r>
-        <w:instrText>https</w:instrText>
-      </w:r>
-      <w:r>
-        <w:rPr>
-          <w:lang w:val="ru-RU"/>
-        </w:rPr>
-        <w:instrText>://</w:instrText>
-      </w:r>
-      <w:r>
-        <w:instrText>tools</w:instrText>
-      </w:r>
-      <w:r>
-        <w:rPr>
-          <w:lang w:val="ru-RU"/>
-        </w:rPr>
-        <w:instrText>.</w:instrText>
-      </w:r>
-      <w:r>
-        <w:instrText>ietf</w:instrText>
-      </w:r>
-      <w:r>
-        <w:rPr>
-          <w:lang w:val="ru-RU"/>
-        </w:rPr>
-        <w:instrText>.</w:instrText>
-      </w:r>
-      <w:r>
-        <w:instrText>org</w:instrText>
-      </w:r>
-      <w:r>
-        <w:rPr>
-          <w:lang w:val="ru-RU"/>
-        </w:rPr>
-        <w:instrText>/</w:instrText>
-      </w:r>
-      <w:r>
-        <w:instrText>html</w:instrText>
-      </w:r>
-      <w:r>
-        <w:rPr>
-          <w:lang w:val="ru-RU"/>
-        </w:rPr>
-        <w:instrText>/</w:instrText>
-      </w:r>
-      <w:r>
-        <w:instrText>rfc</w:instrText>
-      </w:r>
-      <w:r>
-        <w:rPr>
-          <w:lang w:val="ru-RU"/>
-        </w:rPr>
-        <w:instrText>2616" \</w:instrText>
-      </w:r>
-      <w:r>
-        <w:instrText>l</w:instrText>
-      </w:r>
-      <w:r>
-        <w:rPr>
-          <w:lang w:val="ru-RU"/>
-        </w:rPr>
-        <w:instrText xml:space="preserve"> "</w:instrText>
-      </w:r>
-      <w:r>
-        <w:instrText>section</w:instrText>
-      </w:r>
-      <w:r>
-        <w:rPr>
-          <w:lang w:val="ru-RU"/>
-        </w:rPr>
-        <w:instrText>-5.1.2" \</w:instrText>
-      </w:r>
-      <w:r>
-        <w:instrText>t</w:instrText>
-      </w:r>
-      <w:r>
-        <w:rPr>
-          <w:lang w:val="ru-RU"/>
-        </w:rPr>
-        <w:instrText xml:space="preserve"> "_</w:instrText>
-      </w:r>
-      <w:r>
-        <w:instrText>blank</w:instrText>
-      </w:r>
-      <w:r>
-        <w:rPr>
-          <w:lang w:val="ru-RU"/>
-        </w:rPr>
-        <w:instrText>"</w:instrText>
-      </w:r>
-      <w:r>
-        <w:fldChar w:fldCharType="separate"/>
-      </w:r>
-      <w:r>
-        <w:rPr>
-          <w:rStyle w:val="Hyperlink"/>
-          <w:rFonts w:cs="Times New Roman"/>
-          <w:szCs w:val="28"/>
-          <w:lang/>
-        </w:rPr>
-        <w:t>https://tools.ietf.org/html/rfc2616#section-5.1.2</w:t>
-      </w:r>
-      <w:r>
-        <w:fldChar w:fldCharType="end"/>
-      </w:r>
-      <w:r>
-        <w:rPr>
-          <w:rFonts w:cs="Times New Roman"/>
-          <w:szCs w:val="28"/>
-          <w:lang/>
-        </w:rPr>
-        <w:t> тело HTTP-запроса может содержать как путь, так и URL целиком (абзац 1). При работе через прокси-сервер клиент обязан всегда передавать URL целиком (абзац 3). Также RFC предписывает, что в целях совместимости с будущими версиями HTTP, все серверы должны поддерживать оба варианта, хотя клиенты обязаны использовать полный URL только при работе через прокси-сервер (абзац 4). Как выяснилось на практике, не все серверы работают с полными URL, поэтому необходимо преобразовывать его в путь при передаче серверу назначения того, что было передано прокси-серверу от браузера.</w:t>
+          <w:lang w:val="ru-RU"/>
+        </w:rPr>
+      </w:pPr>
+      <w:r>
+        <w:rPr>
+          <w:rFonts w:cs="Times New Roman"/>
+          <w:szCs w:val="28"/>
+          <w:lang w:val="ru-RU"/>
+        </w:rPr>
+        <w:t xml:space="preserve">В соответствии с </w:t>
+      </w:r>
+      <w:r>
+        <w:rPr>
+          <w:rFonts w:cs="Times New Roman"/>
+          <w:szCs w:val="28"/>
+        </w:rPr>
+        <w:t>RFC </w:t>
+      </w:r>
+      <w:hyperlink r:id="rId5" w:anchor="section-5.1.2" w:tgtFrame="_blank" w:history="1">
+        <w:r>
+          <w:rPr>
+            <w:rStyle w:val="Hyperlink"/>
+            <w:rFonts w:cs="Times New Roman"/>
+            <w:szCs w:val="28"/>
+          </w:rPr>
+          <w:t>https</w:t>
+        </w:r>
+        <w:r>
+          <w:rPr>
+            <w:rStyle w:val="Hyperlink"/>
+            <w:rFonts w:cs="Times New Roman"/>
+            <w:szCs w:val="28"/>
+            <w:lang w:val="ru-RU"/>
+          </w:rPr>
+          <w:t>://</w:t>
+        </w:r>
+        <w:r>
+          <w:rPr>
+            <w:rStyle w:val="Hyperlink"/>
+            <w:rFonts w:cs="Times New Roman"/>
+            <w:szCs w:val="28"/>
+          </w:rPr>
+          <w:t>tools</w:t>
+        </w:r>
+        <w:r>
+          <w:rPr>
+            <w:rStyle w:val="Hyperlink"/>
+            <w:rFonts w:cs="Times New Roman"/>
+            <w:szCs w:val="28"/>
+            <w:lang w:val="ru-RU"/>
+          </w:rPr>
+          <w:t>.</w:t>
+        </w:r>
+        <w:proofErr w:type="spellStart"/>
+        <w:r>
+          <w:rPr>
+            <w:rStyle w:val="Hyperlink"/>
+            <w:rFonts w:cs="Times New Roman"/>
+            <w:szCs w:val="28"/>
+          </w:rPr>
+          <w:t>ietf</w:t>
+        </w:r>
+        <w:proofErr w:type="spellEnd"/>
+        <w:r>
+          <w:rPr>
+            <w:rStyle w:val="Hyperlink"/>
+            <w:rFonts w:cs="Times New Roman"/>
+            <w:szCs w:val="28"/>
+            <w:lang w:val="ru-RU"/>
+          </w:rPr>
+          <w:t>.</w:t>
+        </w:r>
+        <w:r>
+          <w:rPr>
+            <w:rStyle w:val="Hyperlink"/>
+            <w:rFonts w:cs="Times New Roman"/>
+            <w:szCs w:val="28"/>
+          </w:rPr>
+          <w:t>org</w:t>
+        </w:r>
+        <w:r>
+          <w:rPr>
+            <w:rStyle w:val="Hyperlink"/>
+            <w:rFonts w:cs="Times New Roman"/>
+            <w:szCs w:val="28"/>
+            <w:lang w:val="ru-RU"/>
+          </w:rPr>
+          <w:t>/</w:t>
+        </w:r>
+        <w:r>
+          <w:rPr>
+            <w:rStyle w:val="Hyperlink"/>
+            <w:rFonts w:cs="Times New Roman"/>
+            <w:szCs w:val="28"/>
+          </w:rPr>
+          <w:t>html</w:t>
+        </w:r>
+        <w:r>
+          <w:rPr>
+            <w:rStyle w:val="Hyperlink"/>
+            <w:rFonts w:cs="Times New Roman"/>
+            <w:szCs w:val="28"/>
+            <w:lang w:val="ru-RU"/>
+          </w:rPr>
+          <w:t>/</w:t>
+        </w:r>
+        <w:proofErr w:type="spellStart"/>
+        <w:r>
+          <w:rPr>
+            <w:rStyle w:val="Hyperlink"/>
+            <w:rFonts w:cs="Times New Roman"/>
+            <w:szCs w:val="28"/>
+          </w:rPr>
+          <w:t>rfc</w:t>
+        </w:r>
+        <w:proofErr w:type="spellEnd"/>
+        <w:r>
+          <w:rPr>
+            <w:rStyle w:val="Hyperlink"/>
+            <w:rFonts w:cs="Times New Roman"/>
+            <w:szCs w:val="28"/>
+            <w:lang w:val="ru-RU"/>
+          </w:rPr>
+          <w:t>2616#</w:t>
+        </w:r>
+        <w:r>
+          <w:rPr>
+            <w:rStyle w:val="Hyperlink"/>
+            <w:rFonts w:cs="Times New Roman"/>
+            <w:szCs w:val="28"/>
+          </w:rPr>
+          <w:t>section</w:t>
+        </w:r>
+        <w:r>
+          <w:rPr>
+            <w:rStyle w:val="Hyperlink"/>
+            <w:rFonts w:cs="Times New Roman"/>
+            <w:szCs w:val="28"/>
+            <w:lang w:val="ru-RU"/>
+          </w:rPr>
+          <w:t>-5.1.2</w:t>
+        </w:r>
+      </w:hyperlink>
+      <w:r>
+        <w:rPr>
+          <w:rFonts w:cs="Times New Roman"/>
+          <w:szCs w:val="28"/>
+        </w:rPr>
+        <w:t> </w:t>
+      </w:r>
+      <w:r>
+        <w:rPr>
+          <w:rFonts w:cs="Times New Roman"/>
+          <w:szCs w:val="28"/>
+          <w:lang w:val="ru-RU"/>
+        </w:rPr>
+        <w:t xml:space="preserve">тело </w:t>
+      </w:r>
+      <w:r>
+        <w:rPr>
+          <w:rFonts w:cs="Times New Roman"/>
+          <w:szCs w:val="28"/>
+        </w:rPr>
+        <w:t>HTTP</w:t>
+      </w:r>
+      <w:r>
+        <w:rPr>
+          <w:rFonts w:cs="Times New Roman"/>
+          <w:szCs w:val="28"/>
+          <w:lang w:val="ru-RU"/>
+        </w:rPr>
+        <w:t xml:space="preserve">-запроса может содержать как путь, так и </w:t>
+      </w:r>
+      <w:r>
+        <w:rPr>
+          <w:rFonts w:cs="Times New Roman"/>
+          <w:szCs w:val="28"/>
+        </w:rPr>
+        <w:t>URL</w:t>
+      </w:r>
+      <w:r>
+        <w:rPr>
+          <w:rFonts w:cs="Times New Roman"/>
+          <w:szCs w:val="28"/>
+          <w:lang w:val="ru-RU"/>
+        </w:rPr>
+        <w:t xml:space="preserve"> целиком (абзац 1). При работе через</w:t>
+      </w:r>
+      <w:r>
+        <w:rPr>
+          <w:rFonts w:cs="Times New Roman"/>
+          <w:szCs w:val="28"/>
+        </w:rPr>
+        <w:t> </w:t>
+      </w:r>
+      <w:r>
+        <w:rPr>
+          <w:rFonts w:cs="Times New Roman"/>
+          <w:szCs w:val="28"/>
+          <w:lang w:val="ru-RU"/>
+        </w:rPr>
+        <w:t>прокси-сервер</w:t>
+      </w:r>
+      <w:r>
+        <w:rPr>
+          <w:rFonts w:cs="Times New Roman"/>
+          <w:szCs w:val="28"/>
+        </w:rPr>
+        <w:t> </w:t>
+      </w:r>
+      <w:r>
+        <w:rPr>
+          <w:rFonts w:cs="Times New Roman"/>
+          <w:szCs w:val="28"/>
+          <w:lang w:val="ru-RU"/>
+        </w:rPr>
+        <w:t>клиент обязан всегда передавать</w:t>
+      </w:r>
+      <w:r>
+        <w:rPr>
+          <w:rFonts w:cs="Times New Roman"/>
+          <w:szCs w:val="28"/>
+        </w:rPr>
+        <w:t> URL</w:t>
+      </w:r>
+      <w:r>
+        <w:rPr>
+          <w:rFonts w:cs="Times New Roman"/>
+          <w:szCs w:val="28"/>
+          <w:lang w:val="ru-RU"/>
+        </w:rPr>
+        <w:t xml:space="preserve"> целиком</w:t>
+      </w:r>
+      <w:r>
+        <w:rPr>
+          <w:rFonts w:cs="Times New Roman"/>
+          <w:szCs w:val="28"/>
+        </w:rPr>
+        <w:t> </w:t>
+      </w:r>
+      <w:r>
+        <w:rPr>
+          <w:rFonts w:cs="Times New Roman"/>
+          <w:szCs w:val="28"/>
+          <w:lang w:val="ru-RU"/>
+        </w:rPr>
+        <w:t xml:space="preserve">(абзац 3). Также </w:t>
+      </w:r>
+      <w:r>
+        <w:rPr>
+          <w:rFonts w:cs="Times New Roman"/>
+          <w:szCs w:val="28"/>
+        </w:rPr>
+        <w:t>RFC</w:t>
+      </w:r>
+      <w:r>
+        <w:rPr>
+          <w:rFonts w:cs="Times New Roman"/>
+          <w:szCs w:val="28"/>
+          <w:lang w:val="ru-RU"/>
+        </w:rPr>
+        <w:t xml:space="preserve"> предписывает, что в целях совместимости с будущими версиями </w:t>
+      </w:r>
+      <w:r>
+        <w:rPr>
+          <w:rFonts w:cs="Times New Roman"/>
+          <w:szCs w:val="28"/>
+        </w:rPr>
+        <w:t>HTTP</w:t>
+      </w:r>
+      <w:r>
+        <w:rPr>
+          <w:rFonts w:cs="Times New Roman"/>
+          <w:szCs w:val="28"/>
+          <w:lang w:val="ru-RU"/>
+        </w:rPr>
+        <w:t>, все серверы должны</w:t>
+      </w:r>
+      <w:r>
+        <w:rPr>
+          <w:rFonts w:cs="Times New Roman"/>
+          <w:szCs w:val="28"/>
+        </w:rPr>
+        <w:t> </w:t>
+      </w:r>
+      <w:r>
+        <w:rPr>
+          <w:rFonts w:cs="Times New Roman"/>
+          <w:szCs w:val="28"/>
+          <w:lang w:val="ru-RU"/>
+        </w:rPr>
+        <w:t xml:space="preserve">поддерживать оба варианта, хотя клиенты обязаны использовать полный </w:t>
+      </w:r>
+      <w:r>
+        <w:rPr>
+          <w:rFonts w:cs="Times New Roman"/>
+          <w:szCs w:val="28"/>
+        </w:rPr>
+        <w:t>URL</w:t>
+      </w:r>
+      <w:r>
+        <w:rPr>
+          <w:rFonts w:cs="Times New Roman"/>
+          <w:szCs w:val="28"/>
+          <w:lang w:val="ru-RU"/>
+        </w:rPr>
+        <w:t xml:space="preserve"> только при работе через прокси-сервер (абзац 4). Как выяснилось на практике, не все серверы работают с полными </w:t>
+      </w:r>
+      <w:r>
+        <w:rPr>
+          <w:rFonts w:cs="Times New Roman"/>
+          <w:szCs w:val="28"/>
+        </w:rPr>
+        <w:t>URL</w:t>
+      </w:r>
+      <w:r>
+        <w:rPr>
+          <w:rFonts w:cs="Times New Roman"/>
+          <w:szCs w:val="28"/>
+          <w:lang w:val="ru-RU"/>
+        </w:rPr>
+        <w:t>, поэтому необходимо преобразовывать его в путь при передаче серверу назначения того, что было передано прокси-серверу от браузера.</w:t>
       </w:r>
     </w:p>
     <w:p>
@@ -1067,16 +1464,30 @@
         <w:rPr>
           <w:rFonts w:cs="Times New Roman"/>
           <w:szCs w:val="28"/>
-          <w:lang/>
-        </w:rPr>
-      </w:pPr>
-      <w:r>
-        <w:rPr>
-          <w:rFonts w:cs="Times New Roman"/>
-          <w:szCs w:val="28"/>
-          <w:lang/>
-        </w:rPr>
-        <w:t>К примеру:</w:t>
+        </w:rPr>
+      </w:pPr>
+      <w:r>
+        <w:rPr>
+          <w:rFonts w:cs="Times New Roman"/>
+          <w:szCs w:val="28"/>
+        </w:rPr>
+        <w:t xml:space="preserve">К </w:t>
+      </w:r>
+      <w:proofErr w:type="spellStart"/>
+      <w:r>
+        <w:rPr>
+          <w:rFonts w:cs="Times New Roman"/>
+          <w:szCs w:val="28"/>
+        </w:rPr>
+        <w:t>примеру</w:t>
+      </w:r>
+      <w:proofErr w:type="spellEnd"/>
+      <w:r>
+        <w:rPr>
+          <w:rFonts w:cs="Times New Roman"/>
+          <w:szCs w:val="28"/>
+        </w:rPr>
+        <w:t>:</w:t>
       </w:r>
     </w:p>
     <w:p>
@@ -1095,16 +1506,132 @@
         <w:rPr>
           <w:rFonts w:cs="Times New Roman"/>
           <w:szCs w:val="28"/>
-          <w:lang/>
-        </w:rPr>
-      </w:pPr>
-      <w:r>
-        <w:rPr>
-          <w:rFonts w:cs="Times New Roman"/>
-          <w:szCs w:val="28"/>
-          <w:lang/>
-        </w:rPr>
-        <w:t> Браузер -&gt; прокси-сервер: GET http://live.legendy.by:8000/legendyfm HTTP/1.1</w:t>
+          <w:lang w:val="ru-RU"/>
+        </w:rPr>
+      </w:pPr>
+      <w:r>
+        <w:rPr>
+          <w:rFonts w:cs="Times New Roman"/>
+          <w:szCs w:val="28"/>
+        </w:rPr>
+        <w:t> </w:t>
+      </w:r>
+      <w:r>
+        <w:rPr>
+          <w:rFonts w:cs="Times New Roman"/>
+          <w:szCs w:val="28"/>
+          <w:lang w:val="ru-RU"/>
+        </w:rPr>
+        <w:t>Браузер -&gt; прокси-сервер:</w:t>
+      </w:r>
+      <w:r>
+        <w:rPr>
+          <w:rFonts w:cs="Times New Roman"/>
+          <w:szCs w:val="28"/>
+        </w:rPr>
+        <w:t> GET</w:t>
+      </w:r>
+      <w:r>
+        <w:rPr>
+          <w:rFonts w:cs="Times New Roman"/>
+          <w:szCs w:val="28"/>
+          <w:lang w:val="ru-RU"/>
+        </w:rPr>
+        <w:t xml:space="preserve"> </w:t>
+      </w:r>
+      <w:r>
+        <w:rPr>
+          <w:rFonts w:cs="Times New Roman"/>
+          <w:szCs w:val="28"/>
+        </w:rPr>
+        <w:t>http</w:t>
+      </w:r>
+      <w:r>
+        <w:rPr>
+          <w:rFonts w:cs="Times New Roman"/>
+          <w:szCs w:val="28"/>
+          <w:lang w:val="ru-RU"/>
+        </w:rPr>
+        <w:t>://</w:t>
+      </w:r>
+      <w:r>
+        <w:rPr>
+          <w:rFonts w:cs="Times New Roman"/>
+          <w:szCs w:val="28"/>
+        </w:rPr>
+        <w:t>live</w:t>
+      </w:r>
+      <w:r>
+        <w:rPr>
+          <w:rFonts w:cs="Times New Roman"/>
+          <w:szCs w:val="28"/>
+          <w:lang w:val="ru-RU"/>
+        </w:rPr>
+        <w:t>.</w:t>
+      </w:r>
+      <w:proofErr w:type="spellStart"/>
+      <w:r>
+        <w:rPr>
+          <w:rFonts w:cs="Times New Roman"/>
+          <w:szCs w:val="28"/>
+        </w:rPr>
+        <w:t>legendy</w:t>
+      </w:r>
+      <w:proofErr w:type="spellEnd"/>
+      <w:r>
+        <w:rPr>
+          <w:rFonts w:cs="Times New Roman"/>
+          <w:szCs w:val="28"/>
+          <w:lang w:val="ru-RU"/>
+        </w:rPr>
+        <w:t>.</w:t>
+      </w:r>
+      <w:r>
+        <w:rPr>
+          <w:rFonts w:cs="Times New Roman"/>
+          <w:szCs w:val="28"/>
+        </w:rPr>
+        <w:t>by</w:t>
+      </w:r>
+      <w:r>
+        <w:rPr>
+          <w:rFonts w:cs="Times New Roman"/>
+          <w:szCs w:val="28"/>
+          <w:lang w:val="ru-RU"/>
+        </w:rPr>
+        <w:t>:8000/</w:t>
+      </w:r>
+      <w:proofErr w:type="spellStart"/>
+      <w:r>
+        <w:rPr>
+          <w:rFonts w:cs="Times New Roman"/>
+          <w:szCs w:val="28"/>
+        </w:rPr>
+        <w:t>legendyfm</w:t>
+      </w:r>
+      <w:proofErr w:type="spellEnd"/>
+      <w:r>
+        <w:rPr>
+          <w:rFonts w:cs="Times New Roman"/>
+          <w:szCs w:val="28"/>
+          <w:lang w:val="ru-RU"/>
+        </w:rPr>
+        <w:t xml:space="preserve"> </w:t>
+      </w:r>
+      <w:r>
+        <w:rPr>
+          <w:rFonts w:cs="Times New Roman"/>
+          <w:szCs w:val="28"/>
+        </w:rPr>
+        <w:t>HTTP</w:t>
+      </w:r>
+      <w:r>
+        <w:rPr>
+          <w:rFonts w:cs="Times New Roman"/>
+          <w:szCs w:val="28"/>
+          <w:lang w:val="ru-RU"/>
+        </w:rPr>
+        <w:t>/1.1</w:t>
       </w:r>
     </w:p>
     <w:p>
@@ -1123,14 +1650,12 @@
         <w:rPr>
           <w:rFonts w:cs="Times New Roman"/>
           <w:szCs w:val="28"/>
-          <w:lang/>
-        </w:rPr>
-      </w:pPr>
-      <w:r>
-        <w:rPr>
-          <w:rFonts w:cs="Times New Roman"/>
-          <w:szCs w:val="28"/>
-          <w:lang/>
+        </w:rPr>
+      </w:pPr>
+      <w:r>
+        <w:rPr>
+          <w:rFonts w:cs="Times New Roman"/>
+          <w:szCs w:val="28"/>
         </w:rPr>
         <w:t> Прокси-сервер -&gt; сервер назначения (live.legendy.by): GET /legendyfm HTTP/1.1</w:t>
       </w:r>
@@ -1141,7 +1666,6 @@
         <w:rPr>
           <w:rFonts w:cs="Times New Roman"/>
           <w:szCs w:val="28"/>
-          <w:lang/>
         </w:rPr>
       </w:pPr>
     </w:p>
@@ -1151,14 +1675,14 @@
         <w:rPr>
           <w:rFonts w:cs="Times New Roman"/>
           <w:szCs w:val="28"/>
-          <w:lang/>
-        </w:rPr>
-      </w:pPr>
-      <w:r>
-        <w:rPr>
-          <w:rFonts w:cs="Times New Roman"/>
-          <w:szCs w:val="28"/>
-          <w:lang/>
+          <w:lang w:val="ru-RU"/>
+        </w:rPr>
+      </w:pPr>
+      <w:r>
+        <w:rPr>
+          <w:rFonts w:cs="Times New Roman"/>
+          <w:szCs w:val="28"/>
+          <w:lang w:val="ru-RU"/>
         </w:rPr>
         <w:t>Дополнительное задание</w:t>
       </w:r>
@@ -1169,16 +1693,46 @@
         <w:rPr>
           <w:rFonts w:cs="Times New Roman"/>
           <w:szCs w:val="28"/>
-          <w:lang/>
-        </w:rPr>
-      </w:pPr>
-      <w:r>
-        <w:rPr>
-          <w:rFonts w:cs="Times New Roman"/>
-          <w:szCs w:val="28"/>
-          <w:lang/>
-        </w:rPr>
-        <w:t>Реализовать фильтрацию сайтов по черному списку. В конфигурационном файле для прокси-сервера задается список доменов и/или URL-адресов для блокировки. При попытке загрузить страницу из черного списка прокси-сервер должен вернуть предопределенную страницу с адресом, доступ к которому заблокирован, и сообщением об ошибке.</w:t>
+          <w:lang w:val="ru-RU"/>
+        </w:rPr>
+      </w:pPr>
+      <w:r>
+        <w:rPr>
+          <w:rFonts w:cs="Times New Roman"/>
+          <w:szCs w:val="28"/>
+          <w:lang w:val="ru-RU"/>
+        </w:rPr>
+        <w:t xml:space="preserve">Реализовать фильтрацию сайтов по черному списку. В конфигурационном файле для прокси-сервера задается список доменов и/или </w:t>
+      </w:r>
+      <w:r>
+        <w:rPr>
+          <w:rFonts w:cs="Times New Roman"/>
+          <w:szCs w:val="28"/>
+        </w:rPr>
+        <w:t>URL</w:t>
+      </w:r>
+      <w:r>
+        <w:rPr>
+          <w:rFonts w:cs="Times New Roman"/>
+          <w:szCs w:val="28"/>
+          <w:lang w:val="ru-RU"/>
+        </w:rPr>
+        <w:t>-адресов для блокировки.</w:t>
+      </w:r>
+      <w:r>
+        <w:rPr>
+          <w:rFonts w:cs="Times New Roman"/>
+          <w:szCs w:val="28"/>
+        </w:rPr>
+        <w:t> </w:t>
+      </w:r>
+      <w:r>
+        <w:rPr>
+          <w:rFonts w:cs="Times New Roman"/>
+          <w:szCs w:val="28"/>
+          <w:lang w:val="ru-RU"/>
+        </w:rPr>
+        <w:t>При попытке загрузить страницу из черного списка прокси-сервер должен вернуть предопределенную страницу с адресом, доступ к которому заблокирован, и сообщением об ошибке.</w:t>
       </w:r>
     </w:p>
     <w:p>
@@ -1190,6 +1744,137 @@
           <w:lang w:val="ru-RU"/>
         </w:rPr>
       </w:pPr>
+    </w:p>
+    <w:p>
+      <w:pPr>
+        <w:contextualSpacing/>
+        <w:rPr>
+          <w:rFonts w:cs="Times New Roman"/>
+          <w:szCs w:val="28"/>
+          <w:lang w:val="ru-RU"/>
+        </w:rPr>
+      </w:pPr>
+      <w:r>
+        <w:rPr>
+          <w:rFonts w:cs="Times New Roman"/>
+          <w:szCs w:val="28"/>
+          <w:lang w:val="ru-RU"/>
+        </w:rPr>
+        <w:t xml:space="preserve">Для работы используется операционная система </w:t>
+      </w:r>
+      <w:r>
+        <w:rPr>
+          <w:rFonts w:cs="Times New Roman"/>
+          <w:szCs w:val="28"/>
+        </w:rPr>
+        <w:t>macOS</w:t>
+      </w:r>
+      <w:r>
+        <w:rPr>
+          <w:rFonts w:cs="Times New Roman"/>
+          <w:szCs w:val="28"/>
+          <w:lang w:val="ru-RU"/>
+        </w:rPr>
+        <w:t xml:space="preserve">, в связи с чем </w:t>
+      </w:r>
+      <w:proofErr w:type="spellStart"/>
+      <w:r>
+        <w:rPr>
+          <w:rFonts w:cs="Times New Roman"/>
+          <w:szCs w:val="28"/>
+        </w:rPr>
+        <w:t>src</w:t>
+      </w:r>
+      <w:proofErr w:type="spellEnd"/>
+      <w:r>
+        <w:rPr>
+          <w:rFonts w:cs="Times New Roman"/>
+          <w:szCs w:val="28"/>
+          <w:lang w:val="ru-RU"/>
+        </w:rPr>
+        <w:t xml:space="preserve"> </w:t>
+      </w:r>
+      <w:r>
+        <w:rPr>
+          <w:rFonts w:cs="Times New Roman"/>
+          <w:szCs w:val="28"/>
+          <w:lang w:val="ru-RU"/>
+        </w:rPr>
+        <w:t xml:space="preserve">и </w:t>
+      </w:r>
+      <w:proofErr w:type="spellStart"/>
+      <w:r>
+        <w:rPr>
+          <w:rFonts w:cs="Times New Roman"/>
+          <w:szCs w:val="28"/>
+        </w:rPr>
+        <w:t>dst</w:t>
+      </w:r>
+      <w:proofErr w:type="spellEnd"/>
+      <w:r>
+        <w:rPr>
+          <w:rFonts w:cs="Times New Roman"/>
+          <w:szCs w:val="28"/>
+          <w:lang w:val="ru-RU"/>
+        </w:rPr>
+        <w:t xml:space="preserve"> </w:t>
+      </w:r>
+      <w:r>
+        <w:rPr>
+          <w:rFonts w:cs="Times New Roman"/>
+          <w:szCs w:val="28"/>
+          <w:lang w:val="ru-RU"/>
+        </w:rPr>
+        <w:t xml:space="preserve">адреса будут одинаковы во всех </w:t>
+      </w:r>
+      <w:proofErr w:type="spellStart"/>
+      <w:r>
+        <w:rPr>
+          <w:rFonts w:cs="Times New Roman"/>
+          <w:szCs w:val="28"/>
+        </w:rPr>
+        <w:t>tcp</w:t>
+      </w:r>
+      <w:proofErr w:type="spellEnd"/>
+      <w:r>
+        <w:rPr>
+          <w:rFonts w:cs="Times New Roman"/>
+          <w:szCs w:val="28"/>
+          <w:lang w:val="ru-RU"/>
+        </w:rPr>
+        <w:t xml:space="preserve"> и</w:t>
+      </w:r>
+      <w:r>
+        <w:rPr>
+          <w:rFonts w:cs="Times New Roman"/>
+          <w:szCs w:val="28"/>
+          <w:lang w:val="ru-RU"/>
+        </w:rPr>
+        <w:t xml:space="preserve"> </w:t>
+      </w:r>
+      <w:r>
+        <w:rPr>
+          <w:rFonts w:cs="Times New Roman"/>
+          <w:szCs w:val="28"/>
+        </w:rPr>
+        <w:t>http</w:t>
+      </w:r>
+      <w:r>
+        <w:rPr>
+          <w:rFonts w:cs="Times New Roman"/>
+          <w:szCs w:val="28"/>
+          <w:lang w:val="ru-RU"/>
+        </w:rPr>
+        <w:t xml:space="preserve"> </w:t>
+      </w:r>
+      <w:r>
+        <w:rPr>
+          <w:rFonts w:cs="Times New Roman"/>
+          <w:szCs w:val="28"/>
+          <w:lang w:val="ru-RU"/>
+        </w:rPr>
+        <w:t>пакетах.</w:t>
+      </w:r>
     </w:p>
     <w:p>
       <w:pPr>
@@ -1275,7 +1960,7 @@
                     <pic:cNvPicPr/>
                   </pic:nvPicPr>
                   <pic:blipFill>
-                    <a:blip r:embed="rId5">
+                    <a:blip r:embed="rId6">
                       <a:extLst>
                         <a:ext uri="{28A0092B-C50C-407E-A947-70E740481C1C}">
                           <a14:useLocalDpi xmlns:a14="http://schemas.microsoft.com/office/drawing/2010/main" val="0"/>
@@ -1390,7 +2075,7 @@
                     <pic:cNvPicPr/>
                   </pic:nvPicPr>
                   <pic:blipFill>
-                    <a:blip r:embed="rId6">
+                    <a:blip r:embed="rId7">
                       <a:extLst>
                         <a:ext uri="{28A0092B-C50C-407E-A947-70E740481C1C}">
                           <a14:useLocalDpi xmlns:a14="http://schemas.microsoft.com/office/drawing/2010/main" val="0"/>
@@ -1510,7 +2195,7 @@
                     <pic:cNvPicPr/>
                   </pic:nvPicPr>
                   <pic:blipFill>
-                    <a:blip r:embed="rId7">
+                    <a:blip r:embed="rId8">
                       <a:extLst>
                         <a:ext uri="{28A0092B-C50C-407E-A947-70E740481C1C}">
                           <a14:useLocalDpi xmlns:a14="http://schemas.microsoft.com/office/drawing/2010/main" val="0"/>
@@ -1557,7 +2242,13 @@
         <w:t>Рисунок 3 – Установление соединения между браузером и прокси-сервером</w:t>
       </w:r>
     </w:p>
-    <w:p/>
+    <w:p>
+      <w:pPr>
+        <w:rPr>
+          <w:lang w:val="ru-RU"/>
+        </w:rPr>
+      </w:pPr>
+    </w:p>
     <w:p>
       <w:pPr>
         <w:rPr>
@@ -1613,7 +2304,7 @@
                     <pic:cNvPicPr/>
                   </pic:nvPicPr>
                   <pic:blipFill>
-                    <a:blip r:embed="rId8">
+                    <a:blip r:embed="rId9">
                       <a:extLst>
                         <a:ext uri="{28A0092B-C50C-407E-A947-70E740481C1C}">
                           <a14:useLocalDpi xmlns:a14="http://schemas.microsoft.com/office/drawing/2010/main" val="0"/>
@@ -1674,7 +2365,7 @@
                     <pic:cNvPicPr/>
                   </pic:nvPicPr>
                   <pic:blipFill>
-                    <a:blip r:embed="rId9">
+                    <a:blip r:embed="rId10">
                       <a:extLst>
                         <a:ext uri="{28A0092B-C50C-407E-A947-70E740481C1C}">
                           <a14:useLocalDpi xmlns:a14="http://schemas.microsoft.com/office/drawing/2010/main" val="0"/>
@@ -1708,6 +2399,11 @@
       </w:pPr>
     </w:p>
     <w:p>
+      <w:pPr>
+        <w:rPr>
+          <w:lang w:val="ru-RU"/>
+        </w:rPr>
+      </w:pPr>
       <w:r>
         <w:rPr>
           <w:lang w:val="ru-RU"/>
@@ -1715,7 +2411,13 @@
         <w:t>Программа выполняет логирование следующим образом:</w:t>
       </w:r>
     </w:p>
-    <w:p/>
+    <w:p>
+      <w:pPr>
+        <w:rPr>
+          <w:lang w:val="ru-RU"/>
+        </w:rPr>
+      </w:pPr>
+    </w:p>
     <w:p>
       <w:pPr>
         <w:ind w:firstLine="0"/>
@@ -1741,7 +2443,7 @@
                     <pic:cNvPicPr/>
                   </pic:nvPicPr>
                   <pic:blipFill>
-                    <a:blip r:embed="rId10">
+                    <a:blip r:embed="rId11">
                       <a:extLst>
                         <a:ext uri="{28A0092B-C50C-407E-A947-70E740481C1C}">
                           <a14:useLocalDpi xmlns:a14="http://schemas.microsoft.com/office/drawing/2010/main" val="0"/>
@@ -1784,7 +2486,13 @@
         <w:t>Рисунок 4 – Логирование прокси-сервера</w:t>
       </w:r>
     </w:p>
-    <w:p/>
+    <w:p>
+      <w:pPr>
+        <w:rPr>
+          <w:lang w:val="ru-RU"/>
+        </w:rPr>
+      </w:pPr>
+    </w:p>
     <w:p>
       <w:pPr>
         <w:rPr>
@@ -1852,7 +2560,7 @@
                     <pic:cNvPicPr/>
                   </pic:nvPicPr>
                   <pic:blipFill>
-                    <a:blip r:embed="rId11">
+                    <a:blip r:embed="rId12">
                       <a:extLst>
                         <a:ext uri="{28A0092B-C50C-407E-A947-70E740481C1C}">
                           <a14:useLocalDpi xmlns:a14="http://schemas.microsoft.com/office/drawing/2010/main" val="0"/>
@@ -1984,7 +2692,7 @@
                     <pic:cNvPicPr/>
                   </pic:nvPicPr>
                   <pic:blipFill>
-                    <a:blip r:embed="rId12">
+                    <a:blip r:embed="rId13">
                       <a:extLst>
                         <a:ext uri="{28A0092B-C50C-407E-A947-70E740481C1C}">
                           <a14:useLocalDpi xmlns:a14="http://schemas.microsoft.com/office/drawing/2010/main" val="0"/>
@@ -2066,7 +2774,7 @@
                     <pic:cNvPicPr/>
                   </pic:nvPicPr>
                   <pic:blipFill>
-                    <a:blip r:embed="rId13">
+                    <a:blip r:embed="rId14">
                       <a:extLst>
                         <a:ext uri="{28A0092B-C50C-407E-A947-70E740481C1C}">
                           <a14:useLocalDpi xmlns:a14="http://schemas.microsoft.com/office/drawing/2010/main" val="0"/>
@@ -2148,7 +2856,7 @@
         </w:rPr>
         <w:t xml:space="preserve">Тестирование черного списка. Добавим </w:t>
       </w:r>
-      <w:hyperlink r:id="rId14" w:history="1">
+      <w:hyperlink r:id="rId15" w:history="1">
         <w:r>
           <w:rPr>
             <w:rStyle w:val="Hyperlink"/>
@@ -2227,7 +2935,7 @@
                     <pic:cNvPicPr/>
                   </pic:nvPicPr>
                   <pic:blipFill>
-                    <a:blip r:embed="rId15">
+                    <a:blip r:embed="rId16">
                       <a:extLst>
                         <a:ext uri="{28A0092B-C50C-407E-A947-70E740481C1C}">
                           <a14:useLocalDpi xmlns:a14="http://schemas.microsoft.com/office/drawing/2010/main" val="0"/>
@@ -2275,7 +2983,13 @@
         <w:t>Рисунок 8 – Черный список прокси-сервера</w:t>
       </w:r>
     </w:p>
-    <w:p/>
+    <w:p>
+      <w:pPr>
+        <w:rPr>
+          <w:lang w:val="ru-RU"/>
+        </w:rPr>
+      </w:pPr>
+    </w:p>
     <w:p>
       <w:pPr>
         <w:rPr>
@@ -2331,7 +3045,7 @@
                     <pic:cNvPicPr/>
                   </pic:nvPicPr>
                   <pic:blipFill>
-                    <a:blip r:embed="rId16">
+                    <a:blip r:embed="rId17">
                       <a:extLst>
                         <a:ext uri="{28A0092B-C50C-407E-A947-70E740481C1C}">
                           <a14:useLocalDpi xmlns:a14="http://schemas.microsoft.com/office/drawing/2010/main" val="0"/>
@@ -2411,7 +3125,7 @@
                     <pic:cNvPicPr/>
                   </pic:nvPicPr>
                   <pic:blipFill>
-                    <a:blip r:embed="rId17">
+                    <a:blip r:embed="rId18">
                       <a:extLst>
                         <a:ext uri="{28A0092B-C50C-407E-A947-70E740481C1C}">
                           <a14:useLocalDpi xmlns:a14="http://schemas.microsoft.com/office/drawing/2010/main" val="0"/>
@@ -2472,6 +3186,11 @@
       </w:pPr>
     </w:p>
     <w:p>
+      <w:pPr>
+        <w:rPr>
+          <w:lang w:val="ru-RU"/>
+        </w:rPr>
+      </w:pPr>
       <w:r>
         <w:rPr>
           <w:lang w:val="ru-RU"/>
@@ -2491,6 +3210,9 @@
     <w:p>
       <w:pPr>
         <w:ind w:firstLine="0"/>
+        <w:rPr>
+          <w:lang w:val="ru-RU"/>
+        </w:rPr>
       </w:pPr>
     </w:p>
     <w:p>
@@ -2518,7 +3240,7 @@
                     <pic:cNvPicPr/>
                   </pic:nvPicPr>
                   <pic:blipFill>
-                    <a:blip r:embed="rId18">
+                    <a:blip r:embed="rId19">
                       <a:extLst>
                         <a:ext uri="{28A0092B-C50C-407E-A947-70E740481C1C}">
                           <a14:useLocalDpi xmlns:a14="http://schemas.microsoft.com/office/drawing/2010/main" val="0"/>
@@ -2631,7 +3353,13 @@
         <w:t>.</w:t>
       </w:r>
     </w:p>
-    <w:p/>
+    <w:p>
+      <w:pPr>
+        <w:rPr>
+          <w:lang w:val="ru-RU"/>
+        </w:rPr>
+      </w:pPr>
+    </w:p>
     <w:p>
       <w:pPr>
         <w:rPr>

</xml_diff>